<commit_message>
Remove private Google AI Studio and account screenshots from documentation and assets
</commit_message>
<xml_diff>
--- a/PROJECT_MASTER_EXPLANATION_REPORT.docx
+++ b/PROJECT_MASTER_EXPLANATION_REPORT.docx
@@ -680,124 +680,6 @@
     </w:p>
     <w:p>
       <w:pPr>
-        <w:spacing w:before="160"/>
-      </w:pPr>
-    </w:p>
-    <w:p>
-      <w:pPr>
-        <w:jc w:val="center"/>
-      </w:pPr>
-    </w:p>
-    <w:p>
-      <w:r>
-        <w:drawing>
-          <wp:inline xmlns:a="http://schemas.openxmlformats.org/drawingml/2006/main" xmlns:pic="http://schemas.openxmlformats.org/drawingml/2006/picture">
-            <wp:extent cx="5303520" cy="2978051"/>
-            <wp:docPr id="5" name="Picture 5"/>
-            <wp:cNvGraphicFramePr>
-              <a:graphicFrameLocks noChangeAspect="1"/>
-            </wp:cNvGraphicFramePr>
-            <a:graphic>
-              <a:graphicData uri="http://schemas.openxmlformats.org/drawingml/2006/picture">
-                <pic:pic>
-                  <pic:nvPicPr>
-                    <pic:cNvPr id="0" name="05_api_usage_proof.png"/>
-                    <pic:cNvPicPr/>
-                  </pic:nvPicPr>
-                  <pic:blipFill>
-                    <a:blip r:embed="rId13"/>
-                    <a:stretch>
-                      <a:fillRect/>
-                    </a:stretch>
-                  </pic:blipFill>
-                  <pic:spPr>
-                    <a:xfrm>
-                      <a:off x="0" y="0"/>
-                      <a:ext cx="5303520" cy="2978051"/>
-                    </a:xfrm>
-                    <a:prstGeom prst="rect"/>
-                  </pic:spPr>
-                </pic:pic>
-              </a:graphicData>
-            </a:graphic>
-          </wp:inline>
-        </w:drawing>
-      </w:r>
-    </w:p>
-    <w:p>
-      <w:pPr>
-        <w:jc w:val="center"/>
-      </w:pPr>
-      <w:r>
-        <w:rPr>
-          <w:i/>
-          <w:color w:val="64748B"/>
-          <w:sz w:val="17"/>
-        </w:rPr>
-        <w:t>Figure 5: Google AI Studio Quota Proof: Empirical proof of API safety: Exactly 2 requests used with 100% success rate and zero errors.</w:t>
-      </w:r>
-    </w:p>
-    <w:p>
-      <w:pPr>
-        <w:spacing w:before="160"/>
-      </w:pPr>
-    </w:p>
-    <w:p>
-      <w:pPr>
-        <w:jc w:val="center"/>
-      </w:pPr>
-    </w:p>
-    <w:p>
-      <w:r>
-        <w:drawing>
-          <wp:inline xmlns:a="http://schemas.openxmlformats.org/drawingml/2006/main" xmlns:pic="http://schemas.openxmlformats.org/drawingml/2006/picture">
-            <wp:extent cx="5303520" cy="2978051"/>
-            <wp:docPr id="6" name="Picture 6"/>
-            <wp:cNvGraphicFramePr>
-              <a:graphicFrameLocks noChangeAspect="1"/>
-            </wp:cNvGraphicFramePr>
-            <a:graphic>
-              <a:graphicData uri="http://schemas.openxmlformats.org/drawingml/2006/picture">
-                <pic:pic>
-                  <pic:nvPicPr>
-                    <pic:cNvPr id="0" name="06_token_consumption_graph.png"/>
-                    <pic:cNvPicPr/>
-                  </pic:nvPicPr>
-                  <pic:blipFill>
-                    <a:blip r:embed="rId14"/>
-                    <a:stretch>
-                      <a:fillRect/>
-                    </a:stretch>
-                  </pic:blipFill>
-                  <pic:spPr>
-                    <a:xfrm>
-                      <a:off x="0" y="0"/>
-                      <a:ext cx="5303520" cy="2978051"/>
-                    </a:xfrm>
-                    <a:prstGeom prst="rect"/>
-                  </pic:spPr>
-                </pic:pic>
-              </a:graphicData>
-            </a:graphic>
-          </wp:inline>
-        </w:drawing>
-      </w:r>
-    </w:p>
-    <w:p>
-      <w:pPr>
-        <w:jc w:val="center"/>
-      </w:pPr>
-      <w:r>
-        <w:rPr>
-          <w:i/>
-          <w:color w:val="64748B"/>
-          <w:sz w:val="17"/>
-        </w:rPr>
-        <w:t>Figure 6: Real Token Consumption Spike: Total tokens consumed was only ~800 tokens out of a 250,000 tokens/minute allowance (0.32% consumption).</w:t>
-      </w:r>
-    </w:p>
-    <w:p>
-      <w:pPr>
         <w:pStyle w:val="Heading1"/>
       </w:pPr>
       <w:r>

</xml_diff>